<commit_message>
docs: atualiza Dialcron30SL-Rev1 com arquitetura WinForms, remove Android/MAUI, adiciona testes e padroes
</commit_message>
<xml_diff>
--- a/Documentacao/Dialcron30SL-Rev1.docx
+++ b/Documentacao/Dialcron30SL-Rev1.docx
@@ -1,55 +1,5 @@
 
-<file path=docProps\app.xml><?xml version="1.0" encoding="utf-8"?>
-<Properties xmlns="http://schemas.openxmlformats.org/officeDocument/2006/extended-properties" xmlns:vt="http://schemas.openxmlformats.org/officeDocument/2006/docPropsVTypes">
-  <Template>Normal.dotm</Template>
-  <TotalTime>34</TotalTime>
-  <Pages>10</Pages>
-  <Words>1799</Words>
-  <Characters>11046</Characters>
-  <Application>Microsoft Office Word</Application>
-  <DocSecurity>0</DocSecurity>
-  <Lines>690</Lines>
-  <Paragraphs>389</Paragraphs>
-  <ScaleCrop>false</ScaleCrop>
-  <HeadingPairs>
-    <vt:vector size="2" baseType="variant">
-      <vt:variant>
-        <vt:lpstr>Título</vt:lpstr>
-      </vt:variant>
-      <vt:variant>
-        <vt:i4>1</vt:i4>
-      </vt:variant>
-    </vt:vector>
-  </HeadingPairs>
-  <TitlesOfParts>
-    <vt:vector size="1" baseType="lpstr">
-      <vt:lpstr/>
-    </vt:vector>
-  </TitlesOfParts>
-  <Company/>
-  <LinksUpToDate>false</LinksUpToDate>
-  <CharactersWithSpaces>12456</CharactersWithSpaces>
-  <SharedDoc>false</SharedDoc>
-  <HyperlinksChanged>false</HyperlinksChanged>
-  <AppVersion>16.0000</AppVersion>
-</Properties>
-</file>
-
-<file path=docProps\core.xml><?xml version="1.0" encoding="utf-8"?>
-<cp:coreProperties xmlns:cp="http://schemas.openxmlformats.org/package/2006/metadata/core-properties" xmlns:dc="http://purl.org/dc/elements/1.1/" xmlns:dcterms="http://purl.org/dc/terms/" xmlns:dcmitype="http://purl.org/dc/dcmitype/" xmlns:xsi="http://www.w3.org/2001/XMLSchema-instance">
-  <dc:title/>
-  <dc:subject/>
-  <dc:creator>Arthur Marques Diniz</dc:creator>
-  <cp:keywords/>
-  <dc:description/>
-  <cp:lastModifiedBy>Arthur Marques Diniz</cp:lastModifiedBy>
-  <cp:revision>6</cp:revision>
-  <dcterms:created xsi:type="dcterms:W3CDTF">2026-08-30T16:04:00Z</dcterms:created>
-  <dcterms:modified xsi:type="dcterms:W3CDTF">2026-08-30T17:24:00Z</dcterms:modified>
-</cp:coreProperties>
-</file>
-
-<file path=word\document.xml><?xml version="1.0" encoding="utf-8"?>
+<file path=word/document.xml><?xml version="1.0" encoding="utf-8"?>
 <w:document xmlns:wpc="http://schemas.microsoft.com/office/word/2010/wordprocessingCanvas" xmlns:cx="http://schemas.microsoft.com/office/drawing/2014/chartex" xmlns:cx1="http://schemas.microsoft.com/office/drawing/2015/9/8/chartex" xmlns:cx2="http://schemas.microsoft.com/office/drawing/2015/10/21/chartex" xmlns:cx3="http://schemas.microsoft.com/office/drawing/2016/5/9/chartex" xmlns:cx4="http://schemas.microsoft.com/office/drawing/2016/5/10/chartex" xmlns:cx5="http://schemas.microsoft.com/office/drawing/2016/5/11/chartex" xmlns:cx6="http://schemas.microsoft.com/office/drawing/2016/5/12/chartex" xmlns:cx7="http://schemas.microsoft.com/office/drawing/2016/5/13/chartex" xmlns:cx8="http://schemas.microsoft.com/office/drawing/2016/5/14/chartex" xmlns:mc="http://schemas.openxmlformats.org/markup-compatibility/2006" xmlns:aink="http://schemas.microsoft.com/office/drawing/2016/ink" xmlns:am3d="http://schemas.microsoft.com/office/drawing/2017/model3d" xmlns:o="urn:schemas-microsoft-com:office:office" xmlns:oel="http://schemas.microsoft.com/office/2019/extlst" xmlns:r="http://schemas.openxmlformats.org/officeDocument/2006/relationships" xmlns:m="http://schemas.openxmlformats.org/officeDocument/2006/math" xmlns:v="urn:schemas-microsoft-com:vml" xmlns:wp14="http://schemas.microsoft.com/office/word/2010/wordprocessingDrawing" xmlns:wp="http://schemas.openxmlformats.org/drawingml/2006/wordprocessingDrawing" xmlns:w10="urn:schemas-microsoft-com:office:word" xmlns:w="http://schemas.openxmlformats.org/wordprocessingml/2006/main" xmlns:w14="http://schemas.microsoft.com/office/word/2010/wordml" xmlns:w15="http://schemas.microsoft.com/office/word/2012/wordml" xmlns:w16cei="http://schemas.microsoft.com/office/word/2026/wordml/cei" xmlns:w16cex="http://schemas.microsoft.com/office/word/2018/wordml/cex" xmlns:w16cid="http://schemas.microsoft.com/office/word/2016/wordml/cid" xmlns:w16="http://schemas.microsoft.com/office/word/2018/wordml" xmlns:w16du="http://schemas.microsoft.com/office/word/2023/wordml/word16du" xmlns:w16sdtdh="http://schemas.microsoft.com/office/word/2020/wordml/sdtdatahash" xmlns:w16sdtfl="http://schemas.microsoft.com/office/word/2024/wordml/sdtformatlock" xmlns:w16se="http://schemas.microsoft.com/office/word/2015/wordml/symex" xmlns:wpg="http://schemas.microsoft.com/office/word/2010/wordprocessingGroup" xmlns:wpi="http://schemas.microsoft.com/office/word/2010/wordprocessingInk" xmlns:wne="http://schemas.microsoft.com/office/word/2006/wordml" xmlns:wps="http://schemas.microsoft.com/office/word/2010/wordprocessingShape" mc:Ignorable="w14 w15 w16se w16cid w16 w16cex w16sdtdh w16sdtfl w16du wp14">
   <w:body>
     <w:p/>
@@ -4975,7 +4925,7 @@
         <w:ind w:left="360" w:hanging="360"/>
       </w:pPr>
       <w:r>
-        <w:t>Caminho do banco por plataforma (Windows: ao lado do .exe; : FilesDir/DialcronAgendamentos).</w:t>
+        <w:t>Caminho do banco: ao lado do executável (DialcronSBDB.db). Na primeira execução, caso não exista, é copiado a partir de DialcronSB_PADRAO.db (seed).</w:t>
       </w:r>
     </w:p>
     <w:p>
@@ -5909,7 +5859,7 @@
         <w:ind w:left="360" w:hanging="360"/>
       </w:pPr>
       <w:r>
-        <w:t>Code-behind (Pages): UserControls ({NomeFeature}Page.xaml) cujo code-behind chama os DAOs diretamente.</w:t>
+        <w:t>Code-behind (Pages): UserControls ({Nome}UC) em Controls/, com NavigationHelper para troca entre eles. MainForm possui pnlBotoes (menu) e pnlConteudo (área de conteúdo).</w:t>
       </w:r>
     </w:p>
     <w:p>
@@ -5962,7 +5912,7 @@
         <w:ind w:left="360" w:hanging="360"/>
       </w:pPr>
       <w:r>
-        <w:t>Repositório local atual: C:\Git\Dialcron3 (link remoto a configurar).</w:t>
+        <w:t>Repositório local atual: C:\Git\DialcronWinforms (link remoto a configurar).</w:t>
       </w:r>
     </w:p>
     <w:p>
@@ -5984,7 +5934,7 @@
         <w:ind w:left="360" w:hanging="360"/>
       </w:pPr>
       <w:r>
-        <w:t>Modelo: GitHub Flow.</w:t>
+        <w:t>Modelo: GitFlow (main, develop, feat/*, release/*, hotfix/*) conforme Documentacao/GitFlow.md.</w:t>
       </w:r>
     </w:p>
     <w:p>
@@ -6250,10 +6200,7 @@
         </w:rPr>
       </w:pPr>
       <w:r>
-        <w:rPr>
-          <w:lang w:val="en-US"/>
-        </w:rPr>
-        <w:t>Workflow GitHub Actions (build.yml) em push para main, pull request e workflow_dispatch.</w:t>
+        <w:t>Workflows GitHub Actions (.github/workflows/ci.yml e release.yml) CI executa restore, build e testes em Windows (.NET 10). Release gera artefato self-contained quando publicado.</w:t>
       </w:r>
     </w:p>
     <w:p>
@@ -6268,10 +6215,7 @@
         </w:rPr>
       </w:pPr>
       <w:r>
-        <w:rPr>
-          <w:lang w:val="it-IT"/>
-        </w:rPr>
-        <w:t>Gera artefato Windows standalone (Dialcron-Windows.zip) e  (Dialcron-).</w:t>
+        <w:t>Gera artefato Windows x64 self-contained single-file (Dialcron-Windows.zip).</w:t>
       </w:r>
     </w:p>
     <w:p>
@@ -6825,6 +6769,232 @@
     </w:tbl>
     <w:p/>
     <w:p/>
+    <w:p>
+      <w:r>
+        <w:br w:type="page"/>
+      </w:r>
+    </w:p>
+    <w:p>
+      <w:pPr>
+        <w:pStyle w:val="Ttulo1"/>
+      </w:pPr>
+      <w:r>
+        <w:t>6. Testes Automatizados</w:t>
+      </w:r>
+    </w:p>
+    <w:p>
+      <w:pPr>
+        <w:pStyle w:val="Ttulo2"/>
+      </w:pPr>
+      <w:r>
+        <w:t>6.1 Projeto de Testes</w:t>
+      </w:r>
+    </w:p>
+    <w:p>
+      <w:r>
+        <w:t>Projeto: DialcronWinforms.Tests (net10.0-windows)</w:t>
+      </w:r>
+    </w:p>
+    <w:p>
+      <w:r>
+        <w:t>Framework: xUnit</w:t>
+      </w:r>
+    </w:p>
+    <w:p>
+      <w:r>
+        <w:t>Cobertura: Camada de Dados (DAOs)</w:t>
+      </w:r>
+    </w:p>
+    <w:p>
+      <w:pPr>
+        <w:pStyle w:val="Ttulo2"/>
+      </w:pPr>
+      <w:r>
+        <w:t>6.2 Estrutura</w:t>
+      </w:r>
+    </w:p>
+    <w:p>
+      <w:r>
+        <w:t>- DialcronWinforms.Tests/Support/SqliteTestDatabase.cs</w:t>
+      </w:r>
+    </w:p>
+    <w:p>
+      <w:r>
+        <w:t>- DialcronWinforms.Tests/Data/*DAOTests.cs</w:t>
+      </w:r>
+    </w:p>
+    <w:p>
+      <w:pPr>
+        <w:pStyle w:val="Ttulo2"/>
+      </w:pPr>
+      <w:r>
+        <w:t>6.3 Cobertura Atual</w:t>
+      </w:r>
+    </w:p>
+    <w:p>
+      <w:r>
+        <w:t>AtendimentoDAOTests, BackupDAOTests, ClienteDAOTests, ProfissionalDAOTests, ServicoDAOTests, UnidadeDAOTests (43 testes)</w:t>
+      </w:r>
+    </w:p>
+    <w:p>
+      <w:pPr>
+        <w:pStyle w:val="Ttulo2"/>
+      </w:pPr>
+      <w:r>
+        <w:t>6.4 Como Executar</w:t>
+      </w:r>
+    </w:p>
+    <w:p>
+      <w:r>
+        <w:t>dotnet test DialcronWinforms.sln</w:t>
+      </w:r>
+    </w:p>
+    <w:p>
+      <w:r>
+        <w:t>ou</w:t>
+      </w:r>
+    </w:p>
+    <w:p>
+      <w:r>
+        <w:t>dotnet test DialcronWinforms.Tests</w:t>
+      </w:r>
+    </w:p>
+    <w:p>
+      <w:pPr>
+        <w:pStyle w:val="Ttulo2"/>
+      </w:pPr>
+      <w:r>
+        <w:t>6.5 Observações</w:t>
+      </w:r>
+    </w:p>
+    <w:p>
+      <w:r>
+        <w:t>- Usa banco SQLite temporário isolado por teste</w:t>
+      </w:r>
+    </w:p>
+    <w:p>
+      <w:r>
+        <w:t>- Implementa IAsyncLifetime</w:t>
+      </w:r>
+    </w:p>
+    <w:p>
+      <w:r>
+        <w:t>- Pasta de testes excluída da compilação do executável (DialcronWinforms.csproj)</w:t>
+      </w:r>
+    </w:p>
+    <w:p>
+      <w:r>
+        <w:br w:type="page"/>
+      </w:r>
+    </w:p>
+    <w:p>
+      <w:pPr>
+        <w:pStyle w:val="Ttulo1"/>
+      </w:pPr>
+      <w:r>
+        <w:t>7. Padrões, Convenções e Identidade Visual</w:t>
+      </w:r>
+    </w:p>
+    <w:p>
+      <w:pPr>
+        <w:pStyle w:val="Ttulo2"/>
+      </w:pPr>
+      <w:r>
+        <w:t>7.1 Identidade Visual</w:t>
+      </w:r>
+    </w:p>
+    <w:p>
+      <w:r>
+        <w:t>Paleta definida em Cores.cs: Primary (#8E3B52), Secondary (#F5E8E5), Tertiary (#C77C8A), Creme (#FFF8F5), Sucesso (#72A68A), Atencao (#D6A84F), Erro (#C95C62).</w:t>
+      </w:r>
+    </w:p>
+    <w:p>
+      <w:pPr>
+        <w:pStyle w:val="Ttulo2"/>
+      </w:pPr>
+      <w:r>
+        <w:t>7.2 Navegação</w:t>
+      </w:r>
+    </w:p>
+    <w:p>
+      <w:r>
+        <w:t>- Telas são UserControls em Controls/</w:t>
+      </w:r>
+    </w:p>
+    <w:p>
+      <w:r>
+        <w:t>- MainForm possui pnlBotoes (menu) e pnlConteudo (área de conteúdo)</w:t>
+      </w:r>
+    </w:p>
+    <w:p>
+      <w:r>
+        <w:t>- NavigationHelper gerencia troca de telas (Dispose do anterior)</w:t>
+      </w:r>
+    </w:p>
+    <w:p>
+      <w:pPr>
+        <w:pStyle w:val="Ttulo2"/>
+      </w:pPr>
+      <w:r>
+        <w:t>7.3 Nomenclatura</w:t>
+      </w:r>
+    </w:p>
+    <w:p>
+      <w:r>
+        <w:t>- UserControls: {Nome}UC</w:t>
+      </w:r>
+    </w:p>
+    <w:p>
+      <w:r>
+        <w:t>- DAOs: {Entidade}DAO</w:t>
+      </w:r>
+    </w:p>
+    <w:p>
+      <w:r>
+        <w:t>- Models: substantivos no singular</w:t>
+      </w:r>
+    </w:p>
+    <w:p>
+      <w:r>
+        <w:t>- Métodos CRUD: GetAllAsync, GetByIdAsync, InsertAsync, UpdateAsync, DeleteAsync</w:t>
+      </w:r>
+    </w:p>
+    <w:p>
+      <w:pPr>
+        <w:pStyle w:val="Ttulo2"/>
+      </w:pPr>
+      <w:r>
+        <w:t>7.4 Formatação e Helpers</w:t>
+      </w:r>
+    </w:p>
+    <w:p>
+      <w:r>
+        <w:t>FuncoesGerais.cs: formatação de telefone/CEP/CNPJ, conversão de valores, tratamento de máscaras.</w:t>
+      </w:r>
+    </w:p>
+    <w:p>
+      <w:pPr>
+        <w:pStyle w:val="Ttulo2"/>
+      </w:pPr>
+      <w:r>
+        <w:t>7.5 Banco</w:t>
+      </w:r>
+    </w:p>
+    <w:p>
+      <w:r>
+        <w:t>- Seed: Documentacao/DialcronSB_PADRAO.db</w:t>
+      </w:r>
+    </w:p>
+    <w:p>
+      <w:r>
+        <w:t>- Trabalho: DialcronSBDB.db (criado ao lado do .exe)</w:t>
+      </w:r>
+    </w:p>
+    <w:p>
+      <w:r>
+        <w:t>- Backup: VACUUM INTO</w:t>
+      </w:r>
+    </w:p>
     <w:sectPr>
       <w:pgSz w:w="12240" w:h="15840"/>
       <w:pgMar w:top="720" w:right="720" w:bottom="720" w:left="720" w:header="720" w:footer="720" w:gutter="0"/>
@@ -6835,45 +7005,7 @@
 </w:document>
 </file>
 
-<file path=word\fontTable.xml><?xml version="1.0" encoding="utf-8"?>
-<w:fonts xmlns:mc="http://schemas.openxmlformats.org/markup-compatibility/2006" xmlns:r="http://schemas.openxmlformats.org/officeDocument/2006/relationships" xmlns:w="http://schemas.openxmlformats.org/wordprocessingml/2006/main" xmlns:w14="http://schemas.microsoft.com/office/word/2010/wordml" xmlns:w15="http://schemas.microsoft.com/office/word/2012/wordml" xmlns:w16cex="http://schemas.microsoft.com/office/word/2018/wordml/cex" xmlns:w16cid="http://schemas.microsoft.com/office/word/2016/wordml/cid" xmlns:w16="http://schemas.microsoft.com/office/word/2018/wordml" xmlns:w16du="http://schemas.microsoft.com/office/word/2023/wordml/word16du" xmlns:w16sdtdh="http://schemas.microsoft.com/office/word/2020/wordml/sdtdatahash" xmlns:w16sdtfl="http://schemas.microsoft.com/office/word/2024/wordml/sdtformatlock" xmlns:w16se="http://schemas.microsoft.com/office/word/2015/wordml/symex" mc:Ignorable="w14 w15 w16se w16cid w16 w16cex w16sdtdh w16sdtfl w16du">
-  <w:font w:name="Symbol">
-    <w:panose1 w:val="05050102010706020507"/>
-    <w:charset w:val="02"/>
-    <w:family w:val="roman"/>
-    <w:pitch w:val="variable"/>
-    <w:sig w:usb0="00000000" w:usb1="10000000" w:usb2="00000000" w:usb3="00000000" w:csb0="80000000" w:csb1="00000000"/>
-  </w:font>
-  <w:font w:name="Times New Roman">
-    <w:panose1 w:val="02020603050405020304"/>
-    <w:charset w:val="00"/>
-    <w:family w:val="roman"/>
-    <w:pitch w:val="variable"/>
-    <w:sig w:usb0="E0002EFF" w:usb1="C000785B" w:usb2="00000009" w:usb3="00000000" w:csb0="000001FF" w:csb1="00000000"/>
-  </w:font>
-  <w:font w:name="Aptos">
-    <w:charset w:val="00"/>
-    <w:family w:val="swiss"/>
-    <w:pitch w:val="variable"/>
-    <w:sig w:usb0="20000287" w:usb1="00000003" w:usb2="00000000" w:usb3="00000000" w:csb0="0000019F" w:csb1="00000000"/>
-  </w:font>
-  <w:font w:name="Calibri">
-    <w:panose1 w:val="020F0502020204030204"/>
-    <w:charset w:val="00"/>
-    <w:family w:val="swiss"/>
-    <w:pitch w:val="variable"/>
-    <w:sig w:usb0="E4002EFF" w:usb1="C200247B" w:usb2="00000009" w:usb3="00000000" w:csb0="000001FF" w:csb1="00000000"/>
-  </w:font>
-  <w:font w:name="Aptos Display">
-    <w:charset w:val="00"/>
-    <w:family w:val="swiss"/>
-    <w:pitch w:val="variable"/>
-    <w:sig w:usb0="20000287" w:usb1="00000003" w:usb2="00000000" w:usb3="00000000" w:csb0="0000019F" w:csb1="00000000"/>
-  </w:font>
-</w:fonts>
-</file>
-
-<file path=word\numbering.xml><?xml version="1.0" encoding="utf-8"?>
+<file path=word/numbering.xml><?xml version="1.0" encoding="utf-8"?>
 <w:numbering xmlns:wpc="http://schemas.microsoft.com/office/word/2010/wordprocessingCanvas" xmlns:cx="http://schemas.microsoft.com/office/drawing/2014/chartex" xmlns:cx1="http://schemas.microsoft.com/office/drawing/2015/9/8/chartex" xmlns:cx2="http://schemas.microsoft.com/office/drawing/2015/10/21/chartex" xmlns:cx3="http://schemas.microsoft.com/office/drawing/2016/5/9/chartex" xmlns:cx4="http://schemas.microsoft.com/office/drawing/2016/5/10/chartex" xmlns:cx5="http://schemas.microsoft.com/office/drawing/2016/5/11/chartex" xmlns:cx6="http://schemas.microsoft.com/office/drawing/2016/5/12/chartex" xmlns:cx7="http://schemas.microsoft.com/office/drawing/2016/5/13/chartex" xmlns:cx8="http://schemas.microsoft.com/office/drawing/2016/5/14/chartex" xmlns:mc="http://schemas.openxmlformats.org/markup-compatibility/2006" xmlns:aink="http://schemas.microsoft.com/office/drawing/2016/ink" xmlns:am3d="http://schemas.microsoft.com/office/drawing/2017/model3d" xmlns:o="urn:schemas-microsoft-com:office:office" xmlns:oel="http://schemas.microsoft.com/office/2019/extlst" xmlns:r="http://schemas.openxmlformats.org/officeDocument/2006/relationships" xmlns:m="http://schemas.openxmlformats.org/officeDocument/2006/math" xmlns:v="urn:schemas-microsoft-com:vml" xmlns:wp14="http://schemas.microsoft.com/office/word/2010/wordprocessingDrawing" xmlns:wp="http://schemas.openxmlformats.org/drawingml/2006/wordprocessingDrawing" xmlns:w10="urn:schemas-microsoft-com:office:word" xmlns:w="http://schemas.openxmlformats.org/wordprocessingml/2006/main" xmlns:w14="http://schemas.microsoft.com/office/word/2010/wordml" xmlns:w15="http://schemas.microsoft.com/office/word/2012/wordml" xmlns:w16cei="http://schemas.microsoft.com/office/word/2026/wordml/cei" xmlns:w16cex="http://schemas.microsoft.com/office/word/2018/wordml/cex" xmlns:w16cid="http://schemas.microsoft.com/office/word/2016/wordml/cid" xmlns:w16="http://schemas.microsoft.com/office/word/2018/wordml" xmlns:w16du="http://schemas.microsoft.com/office/word/2023/wordml/word16du" xmlns:w16sdtdh="http://schemas.microsoft.com/office/word/2020/wordml/sdtdatahash" xmlns:w16sdtfl="http://schemas.microsoft.com/office/word/2024/wordml/sdtformatlock" xmlns:w16se="http://schemas.microsoft.com/office/word/2015/wordml/symex" xmlns:wpg="http://schemas.microsoft.com/office/word/2010/wordprocessingGroup" xmlns:wpi="http://schemas.microsoft.com/office/word/2010/wordprocessingInk" xmlns:wne="http://schemas.microsoft.com/office/word/2006/wordml" xmlns:wps="http://schemas.microsoft.com/office/word/2010/wordprocessingShape" mc:Ignorable="w14 w15 w16se w16cid w16 w16cex w16sdtdh w16sdtfl w16du wp14">
   <w:abstractNum w:abstractNumId="0" w15:restartNumberingAfterBreak="0">
     <w:nsid w:val="FFFFFF89"/>
@@ -6902,67 +7034,7 @@
 </w:numbering>
 </file>
 
-<file path=word\settings.xml><?xml version="1.0" encoding="utf-8"?>
-<w:settings xmlns:mc="http://schemas.openxmlformats.org/markup-compatibility/2006" xmlns:o="urn:schemas-microsoft-com:office:office" xmlns:r="http://schemas.openxmlformats.org/officeDocument/2006/relationships" xmlns:m="http://schemas.openxmlformats.org/officeDocument/2006/math" xmlns:v="urn:schemas-microsoft-com:vml" xmlns:w10="urn:schemas-microsoft-com:office:word" xmlns:w="http://schemas.openxmlformats.org/wordprocessingml/2006/main" xmlns:w14="http://schemas.microsoft.com/office/word/2010/wordml" xmlns:w15="http://schemas.microsoft.com/office/word/2012/wordml" xmlns:w16cex="http://schemas.microsoft.com/office/word/2018/wordml/cex" xmlns:w16cid="http://schemas.microsoft.com/office/word/2016/wordml/cid" xmlns:w16="http://schemas.microsoft.com/office/word/2018/wordml" xmlns:w16du="http://schemas.microsoft.com/office/word/2023/wordml/word16du" xmlns:w16sdtdh="http://schemas.microsoft.com/office/word/2020/wordml/sdtdatahash" xmlns:w16sdtfl="http://schemas.microsoft.com/office/word/2024/wordml/sdtformatlock" xmlns:w16se="http://schemas.microsoft.com/office/word/2015/wordml/symex" xmlns:sl="http://schemas.openxmlformats.org/schemaLibrary/2006/main" mc:Ignorable="w14 w15 w16se w16cid w16 w16cex w16sdtdh w16sdtfl w16du">
-  <w:zoom w:percent="80"/>
-  <w:defaultTabStop w:val="708"/>
-  <w:hyphenationZone w:val="425"/>
-  <w:characterSpacingControl w:val="doNotCompress"/>
-  <w:compat>
-    <w:compatSetting w:name="compatibilityMode" w:uri="http://schemas.microsoft.com/office/word" w:val="15"/>
-    <w:compatSetting w:name="overrideTableStyleFontSizeAndJustification" w:uri="http://schemas.microsoft.com/office/word" w:val="1"/>
-    <w:compatSetting w:name="enableOpenTypeFeatures" w:uri="http://schemas.microsoft.com/office/word" w:val="1"/>
-    <w:compatSetting w:name="doNotFlipMirrorIndents" w:uri="http://schemas.microsoft.com/office/word" w:val="1"/>
-    <w:compatSetting w:name="differentiateMultirowTableHeaders" w:uri="http://schemas.microsoft.com/office/word" w:val="1"/>
-    <w:compatSetting w:name="useWord2013TrackBottomHyphenation" w:uri="http://schemas.microsoft.com/office/word" w:val="0"/>
-  </w:compat>
-  <w:rsids>
-    <w:rsidRoot w:val="00BE4A24"/>
-    <w:rsid w:val="00066C13"/>
-    <w:rsid w:val="001A5160"/>
-    <w:rsid w:val="0026631C"/>
-    <w:rsid w:val="00293534"/>
-    <w:rsid w:val="002C5C28"/>
-    <w:rsid w:val="003B3048"/>
-    <w:rsid w:val="00A11447"/>
-    <w:rsid w:val="00A77AFB"/>
-    <w:rsid w:val="00AF1666"/>
-    <w:rsid w:val="00BE4A24"/>
-    <w:rsid w:val="00C31AE3"/>
-    <w:rsid w:val="00F85E8F"/>
-    <w:rsid w:val="00FB7435"/>
-    <w:rsid w:val="00FE268B"/>
-  </w:rsids>
-  <m:mathPr>
-    <m:mathFont m:val="Cambria Math"/>
-    <m:brkBin m:val="before"/>
-    <m:brkBinSub m:val="--"/>
-    <m:smallFrac m:val="0"/>
-    <m:dispDef/>
-    <m:lMargin m:val="0"/>
-    <m:rMargin m:val="0"/>
-    <m:defJc m:val="centerGroup"/>
-    <m:wrapIndent m:val="1440"/>
-    <m:intLim m:val="subSup"/>
-    <m:naryLim m:val="undOvr"/>
-  </m:mathPr>
-  <w:themeFontLang w:val="pt-BR"/>
-  <w:clrSchemeMapping w:bg1="light1" w:t1="dark1" w:bg2="light2" w:t2="dark2" w:accent1="accent1" w:accent2="accent2" w:accent3="accent3" w:accent4="accent4" w:accent5="accent5" w:accent6="accent6" w:hyperlink="hyperlink" w:followedHyperlink="followedHyperlink"/>
-  <w:shapeDefaults>
-    <o:shapedefaults v:ext="edit" spidmax="1026"/>
-    <o:shapelayout v:ext="edit">
-      <o:idmap v:ext="edit" data="1"/>
-    </o:shapelayout>
-  </w:shapeDefaults>
-  <w:decimalSymbol w:val=","/>
-  <w:listSeparator w:val=";"/>
-  <w14:docId w14:val="43FCE603"/>
-  <w15:chartTrackingRefBased/>
-  <w15:docId w15:val="{3E2DEE24-8103-411F-9847-FA1D92751469}"/>
-</w:settings>
-</file>
-
-<file path=word\styles.xml><?xml version="1.0" encoding="utf-8"?>
+<file path=word/styles.xml><?xml version="1.0" encoding="utf-8"?>
 <w:styles xmlns:mc="http://schemas.openxmlformats.org/markup-compatibility/2006" xmlns:r="http://schemas.openxmlformats.org/officeDocument/2006/relationships" xmlns:w="http://schemas.openxmlformats.org/wordprocessingml/2006/main" xmlns:w14="http://schemas.microsoft.com/office/word/2010/wordml" xmlns:w15="http://schemas.microsoft.com/office/word/2012/wordml" xmlns:w16cex="http://schemas.microsoft.com/office/word/2018/wordml/cex" xmlns:w16cid="http://schemas.microsoft.com/office/word/2016/wordml/cid" xmlns:w16="http://schemas.microsoft.com/office/word/2018/wordml" xmlns:w16du="http://schemas.microsoft.com/office/word/2023/wordml/word16du" xmlns:w16sdtdh="http://schemas.microsoft.com/office/word/2020/wordml/sdtdatahash" xmlns:w16sdtfl="http://schemas.microsoft.com/office/word/2024/wordml/sdtformatlock" xmlns:w16se="http://schemas.microsoft.com/office/word/2015/wordml/symex" mc:Ignorable="w14 w15 w16se w16cid w16 w16cex w16sdtdh w16sdtfl w16du">
   <w:docDefaults>
     <w:rPrDefault>
@@ -7997,7 +8069,7 @@
 </w:styles>
 </file>
 
-<file path=word\theme\theme1.xml><?xml version="1.0" encoding="utf-8"?>
+<file path=word/theme/theme1.xml><?xml version="1.0" encoding="utf-8"?>
 <a:theme xmlns:a="http://schemas.openxmlformats.org/drawingml/2006/main" name="Tema do Office">
   <a:themeElements>
     <a:clrScheme name="Office">
@@ -8290,11 +8362,4 @@
     </a:ext>
   </a:extLst>
 </a:theme>
-</file>
-
-<file path=word\webSettings.xml><?xml version="1.0" encoding="utf-8"?>
-<w:webSettings xmlns:mc="http://schemas.openxmlformats.org/markup-compatibility/2006" xmlns:r="http://schemas.openxmlformats.org/officeDocument/2006/relationships" xmlns:w="http://schemas.openxmlformats.org/wordprocessingml/2006/main" xmlns:w14="http://schemas.microsoft.com/office/word/2010/wordml" xmlns:w15="http://schemas.microsoft.com/office/word/2012/wordml" xmlns:w16cex="http://schemas.microsoft.com/office/word/2018/wordml/cex" xmlns:w16cid="http://schemas.microsoft.com/office/word/2016/wordml/cid" xmlns:w16="http://schemas.microsoft.com/office/word/2018/wordml" xmlns:w16du="http://schemas.microsoft.com/office/word/2023/wordml/word16du" xmlns:w16sdtdh="http://schemas.microsoft.com/office/word/2020/wordml/sdtdatahash" xmlns:w16sdtfl="http://schemas.microsoft.com/office/word/2024/wordml/sdtformatlock" xmlns:w16se="http://schemas.microsoft.com/office/word/2015/wordml/symex" mc:Ignorable="w14 w15 w16se w16cid w16 w16cex w16sdtdh w16sdtfl w16du">
-  <w:optimizeForBrowser/>
-  <w:allowPNG/>
-</w:webSettings>
 </file>
</xml_diff>